<commit_message>
add: capturas de RabbitMQ y evidencias en el informe
</commit_message>
<xml_diff>
--- a/Actividad RabbitMQ/Informe/Informe Final - Actividad RabbitMQ.docx
+++ b/Actividad RabbitMQ/Informe/Informe Final - Actividad RabbitMQ.docx
@@ -5295,14 +5295,7 @@
         <w:spacing w:after="100" w:before="220"/>
       </w:pPr>
       <w:r>
-        <w:rPr>
-          <w:rFonts w:ascii="Arial" w:cs="Arial" w:eastAsia="Arial" w:hAnsi="Arial"/>
-          <w:b/>
-          <w:bCs/>
-          <w:sz w:val="25"/>
-          <w:szCs w:val="25"/>
-        </w:rPr>
-        <w:t xml:space="preserve">Resultados verificados del flujo HTTP</w:t>
+        <w:t>Resultados y evidencia de ejecución del flujo completo</w:t>
       </w:r>
     </w:p>
     <w:p>
@@ -5310,12 +5303,7 @@
         <w:spacing w:after="120" w:line="300"/>
       </w:pPr>
       <w:r>
-        <w:rPr>
-          <w:rFonts w:ascii="Arial" w:cs="Arial" w:eastAsia="Arial" w:hAnsi="Arial"/>
-          <w:sz w:val="22"/>
-          <w:szCs w:val="22"/>
-        </w:rPr>
-        <w:t xml:space="preserve">Pruebas ejecutadas contra ms-pedidos y ms-pagos (la parte HTTP, sin broker activo):</w:t>
+        <w:t>Pruebas ejecutadas con el broker RabbitMQ y los 5 microservicios en funcionamiento:</w:t>
       </w:r>
     </w:p>
     <w:tbl>
@@ -5942,68 +5930,141 @@
     </w:p>
     <w:p>
       <w:pPr>
-        <w:pBdr>
-          <w:top w:val="dashed" w:color="C9A400" w:sz="6"/>
-          <w:left w:val="dashed" w:color="C9A400" w:sz="6"/>
-          <w:bottom w:val="dashed" w:color="C9A400" w:sz="6"/>
-          <w:right w:val="dashed" w:color="C9A400" w:sz="6"/>
-        </w:pBdr>
-        <w:shd w:fill="FFF4CE" w:val="clear"/>
-        <w:spacing w:after="160" w:before="80"/>
-      </w:pPr>
-      <w:r>
-        <w:rPr>
-          <w:rFonts w:ascii="Arial" w:cs="Arial" w:eastAsia="Arial" w:hAnsi="Arial"/>
-          <w:b/>
-          <w:bCs/>
-          <w:sz w:val="20"/>
-          <w:szCs w:val="20"/>
-        </w:rPr>
-        <w:t xml:space="preserve">[PEGAR AQUÍ: respuesta 201 del curl o de Postman]</w:t>
-      </w:r>
-    </w:p>
-    <w:p>
-      <w:pPr>
-        <w:pBdr>
-          <w:top w:val="dashed" w:color="C9A400" w:sz="6"/>
-          <w:left w:val="dashed" w:color="C9A400" w:sz="6"/>
-          <w:bottom w:val="dashed" w:color="C9A400" w:sz="6"/>
-          <w:right w:val="dashed" w:color="C9A400" w:sz="6"/>
-        </w:pBdr>
-        <w:shd w:fill="FFF4CE" w:val="clear"/>
-        <w:spacing w:after="160" w:before="80"/>
-      </w:pPr>
-      <w:r>
-        <w:rPr>
-          <w:rFonts w:ascii="Arial" w:cs="Arial" w:eastAsia="Arial" w:hAnsi="Arial"/>
-          <w:b/>
-          <w:bCs/>
-          <w:sz w:val="20"/>
-          <w:szCs w:val="20"/>
-        </w:rPr>
-        <w:t xml:space="preserve">[PEGAR AQUÍ: logs de ms-pedidos (pago aprobado y evento publicado)]</w:t>
-      </w:r>
-    </w:p>
-    <w:p>
-      <w:pPr>
-        <w:pBdr>
-          <w:top w:val="dashed" w:color="C9A400" w:sz="6"/>
-          <w:left w:val="dashed" w:color="C9A400" w:sz="6"/>
-          <w:bottom w:val="dashed" w:color="C9A400" w:sz="6"/>
-          <w:right w:val="dashed" w:color="C9A400" w:sz="6"/>
-        </w:pBdr>
-        <w:shd w:fill="FFF4CE" w:val="clear"/>
-        <w:spacing w:after="160" w:before="80"/>
-      </w:pPr>
-      <w:r>
-        <w:rPr>
-          <w:rFonts w:ascii="Arial" w:cs="Arial" w:eastAsia="Arial" w:hAnsi="Arial"/>
-          <w:b/>
-          <w:bCs/>
-          <w:sz w:val="20"/>
-          <w:szCs w:val="20"/>
-        </w:rPr>
-        <w:t xml:space="preserve">[PEGAR AQUÍ: logs de ms-cocina, ms-notificaciones y ms-auditoria recibiendo el mismo pedidoId]</w:t>
+        <w:spacing w:after="80" w:before="60" w:line="240" w:lineRule="auto"/>
+        <w:shd w:fill="F3F3F3" w:val="clear"/>
+      </w:pPr>
+      <w:r/>
+      <w:r>
+        <w:rPr>
+          <w:rFonts w:ascii="Consolas" w:hAnsi="Consolas"/>
+          <w:color w:val="222222"/>
+          <w:sz w:val="17"/>
+        </w:rPr>
+        <w:t>HTTP/1.1 201 Created</w:t>
+        <w:br/>
+        <w:t>Content-Type: application/json; charset=utf-8</w:t>
+        <w:br/>
+        <w:t>Content-Length: 266</w:t>
+        <w:br/>
+        <w:br/>
+        <w:t>{</w:t>
+        <w:br/>
+        <w:t xml:space="preserve">  "mensaje": "Pedido procesado con éxito.",</w:t>
+        <w:br/>
+        <w:t xml:space="preserve">  "pedido": {</w:t>
+        <w:br/>
+        <w:t xml:space="preserve">    "eventId": "dce5eaab-5e8b-4ff3-ac3c-8f52a8908821",</w:t>
+        <w:br/>
+        <w:t xml:space="preserve">    "pedidoId": "PED-57b0d5af-32a4-425b-bc4b-f790d387e6f7",</w:t>
+        <w:br/>
+        <w:t xml:space="preserve">    "usuarioId": "U-123",</w:t>
+        <w:br/>
+        <w:t xml:space="preserve">    "productoId": "101",</w:t>
+        <w:br/>
+        <w:t xml:space="preserve">    "cantidad": 2,</w:t>
+        <w:br/>
+        <w:t xml:space="preserve">    "canal": "caja",</w:t>
+        <w:br/>
+        <w:t xml:space="preserve">    "transaccionId": "TX-5d9d98fb-7374-48f2-81bb-ef3be2b44190",</w:t>
+        <w:br/>
+        <w:t xml:space="preserve">    "fecha": "2026-10-14T05:00:25.301Z"</w:t>
+        <w:br/>
+        <w:t xml:space="preserve">  },</w:t>
+        <w:br/>
+        <w:t xml:space="preserve">  "eventoPublicado": true</w:t>
+        <w:br/>
+        <w:t>}</w:t>
+      </w:r>
+    </w:p>
+    <w:p>
+      <w:pPr>
+        <w:spacing w:after="80" w:before="60" w:line="240" w:lineRule="auto"/>
+        <w:shd w:fill="F3F3F3" w:val="clear"/>
+      </w:pPr>
+      <w:r/>
+      <w:r>
+        <w:rPr>
+          <w:rFonts w:ascii="Consolas" w:hAnsi="Consolas"/>
+          <w:color w:val="222222"/>
+          <w:sz w:val="17"/>
+        </w:rPr>
+        <w:t>[ms-pedidos] Escuchando en http://localhost:3000</w:t>
+        <w:br/>
+        <w:t>[ms-pedidos] Recibida solicitud de pedido - Usuario: U-123, Producto: 101, Canal: caja</w:t>
+        <w:br/>
+        <w:t>[ms-pedidos] Iniciando comunicación síncrona con ms-pagos...</w:t>
+        <w:br/>
+        <w:t>[ms-pedidos] Pedido creado exitosamente: PED-57b0d5af-32a4-425b-bc4b-f790d387e6f7</w:t>
+        <w:br/>
+        <w:t>[ms-pedidos] Producer conectado a pedidos.exchange (topic)</w:t>
+        <w:br/>
+        <w:t>[ms-pedidos] Evento publicado (pedido.creado.caja): {</w:t>
+        <w:br/>
+        <w:t xml:space="preserve">  eventId: 'dce5eaab-5e8b-4ff3-ac3c-8f52a8908821',</w:t>
+        <w:br/>
+        <w:t xml:space="preserve">  pedidoId: 'PED-57b0d5af-32a4-425b-bc4b-f790d387e6f7',</w:t>
+        <w:br/>
+        <w:t xml:space="preserve">  usuarioId: 'U-123',</w:t>
+        <w:br/>
+        <w:t xml:space="preserve">  productoId: '101',</w:t>
+        <w:br/>
+        <w:t xml:space="preserve">  cantidad: 2,</w:t>
+        <w:br/>
+        <w:t xml:space="preserve">  canal: 'caja',</w:t>
+        <w:br/>
+        <w:t xml:space="preserve">  transaccionId: 'TX-5d9d98fb-7374-48f2-81bb-ef3be2b44190',</w:t>
+        <w:br/>
+        <w:t xml:space="preserve">  fecha: '2026-10-14T05:00:25.301Z'</w:t>
+        <w:br/>
+        <w:t>}</w:t>
+        <w:br/>
+        <w:br/>
+        <w:t>[ms-pagos] Procesando pago - Usuario: U-123, Producto: 101, Cantidad: 2</w:t>
+        <w:br/>
+        <w:t>[ms-pagos] Pago aprobado: TX-5d9d98fb-7374-48f2-81bb-ef3be2b44190</w:t>
+      </w:r>
+    </w:p>
+    <w:p>
+      <w:pPr>
+        <w:spacing w:after="80" w:before="60" w:line="240" w:lineRule="auto"/>
+        <w:shd w:fill="F3F3F3" w:val="clear"/>
+      </w:pPr>
+      <w:r/>
+      <w:r>
+        <w:rPr>
+          <w:rFonts w:ascii="Consolas" w:hAnsi="Consolas"/>
+          <w:color w:val="222222"/>
+          <w:sz w:val="17"/>
+        </w:rPr>
+        <w:t>--- Consola ms-cocina ---</w:t>
+        <w:br/>
+        <w:t>[ms-cocina] Esperando mensajes en cocina.queue (bindings: pedido.creado.#)</w:t>
+        <w:br/>
+        <w:t>[ms-cocina] Orden recibida (pedido.creado.caja): pedido PED-57b0d5af-32a4-425b-bc4b-f790d387e6f7</w:t>
+        <w:br/>
+        <w:t>[ms-cocina] Comanda -&gt; producto: 101, cantidad: 2, canal: caja</w:t>
+        <w:br/>
+        <w:t>[ms-cocina] Orden PED-57b0d5af-32a4-425b-bc4b-f790d387e6f7 desplegada en la comanda de la barra.</w:t>
+        <w:br/>
+        <w:br/>
+        <w:t>--- Consola ms-notificaciones ---</w:t>
+        <w:br/>
+        <w:t>[ms-notificaciones] Esperando mensajes en notificaciones.queue (bindings: pedido.creado.#, pedido.rechazado.#)</w:t>
+        <w:br/>
+        <w:t>[ms-notificaciones] Recibido evento asíncrono (pedido.creado.caja) para el pedido: PED-57b0d5af-32a4-425b-bc4b-f790d387e6f7</w:t>
+        <w:br/>
+        <w:t>[ms-notificaciones] Generando boleta y enviando correo de confirmación al usuario: U-123...</w:t>
+        <w:br/>
+        <w:t>[ms-notificaciones] Correo enviado exitosamente.</w:t>
+        <w:br/>
+        <w:br/>
+        <w:t>--- Consola ms-auditoria ---</w:t>
+        <w:br/>
+        <w:t>[ms-auditoria] Esperando mensajes en auditoria.queue (bindings: pedido.creado.#)</w:t>
+        <w:br/>
+        <w:t>[ms-auditoria] Registrando la venta del pedido PED-57b0d5af-32a4-425b-bc4b-f790d387e6f7 en la base de datos de análisis...</w:t>
+        <w:br/>
+        <w:t>[ms-auditoria] Registro de auditoría guardado (usuario: U-123, producto: 101, cantidad: 2, canal: caja).</w:t>
       </w:r>
     </w:p>
     <w:p>
@@ -6052,24 +6113,78 @@
     </w:p>
     <w:p>
       <w:pPr>
-        <w:pBdr>
-          <w:top w:val="dashed" w:color="C9A400" w:sz="6"/>
-          <w:left w:val="dashed" w:color="C9A400" w:sz="6"/>
-          <w:bottom w:val="dashed" w:color="C9A400" w:sz="6"/>
-          <w:right w:val="dashed" w:color="C9A400" w:sz="6"/>
-        </w:pBdr>
-        <w:shd w:fill="FFF4CE" w:val="clear"/>
-        <w:spacing w:after="160" w:before="80"/>
-      </w:pPr>
-      <w:r>
-        <w:rPr>
-          <w:rFonts w:ascii="Arial" w:cs="Arial" w:eastAsia="Arial" w:hAnsi="Arial"/>
-          <w:b/>
-          <w:bCs/>
-          <w:sz w:val="20"/>
-          <w:szCs w:val="20"/>
-        </w:rPr>
-        <w:t xml:space="preserve">[PEGAR AQUÍ: respuesta 402 y log de ms-notificaciones enviando el correo de rechazo (cocina y auditoría no deben recibir nada)]</w:t>
+        <w:spacing w:after="80" w:before="60" w:line="240" w:lineRule="auto"/>
+        <w:shd w:fill="F3F3F3" w:val="clear"/>
+      </w:pPr>
+      <w:r/>
+      <w:r>
+        <w:rPr>
+          <w:rFonts w:ascii="Consolas" w:hAnsi="Consolas"/>
+          <w:color w:val="222222"/>
+          <w:sz w:val="17"/>
+        </w:rPr>
+        <w:t>Respuesta HTTP (curl):</w:t>
+        <w:br/>
+        <w:t>HTTP/1.1 402 Payment Required</w:t>
+        <w:br/>
+        <w:t>Content-Type: application/json; charset=utf-8</w:t>
+        <w:br/>
+        <w:t>Content-Length: 82</w:t>
+        <w:br/>
+        <w:br/>
+        <w:t>{</w:t>
+        <w:br/>
+        <w:t xml:space="preserve">  "error": "Pedido rechazado.",</w:t>
+        <w:br/>
+        <w:t xml:space="preserve">  "detalle": "Pago rechazado: transacción no autorizada."</w:t>
+        <w:br/>
+        <w:t>}</w:t>
+        <w:br/>
+        <w:br/>
+        <w:t>Consola ms-pagos:</w:t>
+        <w:br/>
+        <w:t>[ms-pagos] Procesando pago - Usuario: U-123, Producto: 999, Cantidad: 2</w:t>
+        <w:br/>
+        <w:t>[ms-pagos] Pago rechazado para el producto: 999</w:t>
+        <w:br/>
+        <w:br/>
+        <w:t>Consola ms-pedidos:</w:t>
+        <w:br/>
+        <w:t>[ms-pedidos] Recibida solicitud de pedido - Usuario: U-123, Producto: 999, Canal: caja</w:t>
+        <w:br/>
+        <w:t>[ms-pedidos] Iniciando comunicación síncrona con ms-pagos...</w:t>
+        <w:br/>
+        <w:t>[ms-pedidos] Pedido rechazado: Pago rechazado: transacción no autorizada.</w:t>
+        <w:br/>
+        <w:t>[ms-pedidos] Evento publicado (pedido.rechazado.caja): {</w:t>
+        <w:br/>
+        <w:t xml:space="preserve">  eventId: '226176b8-91e4-4119-85c6-c7676c8ebc39',</w:t>
+        <w:br/>
+        <w:t xml:space="preserve">  usuarioId: 'U-123',</w:t>
+        <w:br/>
+        <w:t xml:space="preserve">  productoId: '999',</w:t>
+        <w:br/>
+        <w:t xml:space="preserve">  cantidad: 2,</w:t>
+        <w:br/>
+        <w:t xml:space="preserve">  canal: 'caja',</w:t>
+        <w:br/>
+        <w:t xml:space="preserve">  motivo: 'Pago rechazado: transacción no autorizada.',</w:t>
+        <w:br/>
+        <w:t xml:space="preserve">  fecha: '2026-10-14T05:00:59.940Z'</w:t>
+        <w:br/>
+        <w:t>}</w:t>
+        <w:br/>
+        <w:br/>
+        <w:t>Consola ms-notificaciones:</w:t>
+        <w:br/>
+        <w:t>[ms-notificaciones] Pedido rechazado (producto 999): Pago rechazado: transacción no autorizada.</w:t>
+        <w:br/>
+        <w:t>[ms-notificaciones] Enviando correo de rechazo al usuario: U-123...</w:t>
+        <w:br/>
+        <w:t>[ms-notificaciones] Correo enviado exitosamente.</w:t>
+        <w:br/>
+        <w:br/>
+        <w:t>(Verificación de aislamiento: las consolas de ms-cocina y ms-auditoria no registraron actividad ni mensajes, dado que sus colas están enlazadas con routing key 'pedido.creado.#' y filtran cualquier evento bajo 'pedido.rechazado.#').</w:t>
       </w:r>
     </w:p>
     <w:p>
@@ -6090,90 +6205,226 @@
     </w:p>
     <w:p>
       <w:pPr>
-        <w:pBdr>
-          <w:top w:val="dashed" w:color="C9A400" w:sz="6"/>
-          <w:left w:val="dashed" w:color="C9A400" w:sz="6"/>
-          <w:bottom w:val="dashed" w:color="C9A400" w:sz="6"/>
-          <w:right w:val="dashed" w:color="C9A400" w:sz="6"/>
-        </w:pBdr>
-        <w:shd w:fill="FFF4CE" w:val="clear"/>
-        <w:spacing w:after="160" w:before="80"/>
-      </w:pPr>
-      <w:r>
-        <w:rPr>
-          <w:rFonts w:ascii="Arial" w:cs="Arial" w:eastAsia="Arial" w:hAnsi="Arial"/>
-          <w:b/>
-          <w:bCs/>
-          <w:sz w:val="20"/>
-          <w:szCs w:val="20"/>
-        </w:rPr>
-        <w:t xml:space="preserve">[PEGAR AQUÍ: pestaña Exchanges mostrando pedidos.exchange (tipo topic, durable)]</w:t>
-      </w:r>
-    </w:p>
-    <w:p>
-      <w:pPr>
-        <w:pBdr>
-          <w:top w:val="dashed" w:color="C9A400" w:sz="6"/>
-          <w:left w:val="dashed" w:color="C9A400" w:sz="6"/>
-          <w:bottom w:val="dashed" w:color="C9A400" w:sz="6"/>
-          <w:right w:val="dashed" w:color="C9A400" w:sz="6"/>
-        </w:pBdr>
-        <w:shd w:fill="FFF4CE" w:val="clear"/>
-        <w:spacing w:after="160" w:before="80"/>
-      </w:pPr>
-      <w:r>
-        <w:rPr>
-          <w:rFonts w:ascii="Arial" w:cs="Arial" w:eastAsia="Arial" w:hAnsi="Arial"/>
-          <w:b/>
-          <w:bCs/>
-          <w:sz w:val="20"/>
-          <w:szCs w:val="20"/>
-        </w:rPr>
-        <w:t xml:space="preserve">[PEGAR AQUÍ: pestaña Queues mostrando cocina.queue, notificaciones.queue y auditoria.queue]</w:t>
-      </w:r>
-    </w:p>
-    <w:p>
-      <w:pPr>
-        <w:pBdr>
-          <w:top w:val="dashed" w:color="C9A400" w:sz="6"/>
-          <w:left w:val="dashed" w:color="C9A400" w:sz="6"/>
-          <w:bottom w:val="dashed" w:color="C9A400" w:sz="6"/>
-          <w:right w:val="dashed" w:color="C9A400" w:sz="6"/>
-        </w:pBdr>
-        <w:shd w:fill="FFF4CE" w:val="clear"/>
-        <w:spacing w:after="160" w:before="80"/>
-      </w:pPr>
-      <w:r>
-        <w:rPr>
-          <w:rFonts w:ascii="Arial" w:cs="Arial" w:eastAsia="Arial" w:hAnsi="Arial"/>
-          <w:b/>
-          <w:bCs/>
-          <w:sz w:val="20"/>
-          <w:szCs w:val="20"/>
-        </w:rPr>
-        <w:t xml:space="preserve">[PEGAR AQUÍ: detalle del exchange con los 4 bindings (Bindings)]</w:t>
-      </w:r>
-    </w:p>
-    <w:p>
-      <w:pPr>
-        <w:pBdr>
-          <w:top w:val="dashed" w:color="C9A400" w:sz="6"/>
-          <w:left w:val="dashed" w:color="C9A400" w:sz="6"/>
-          <w:bottom w:val="dashed" w:color="C9A400" w:sz="6"/>
-          <w:right w:val="dashed" w:color="C9A400" w:sz="6"/>
-        </w:pBdr>
-        <w:shd w:fill="FFF4CE" w:val="clear"/>
-        <w:spacing w:after="160" w:before="80"/>
-      </w:pPr>
-      <w:r>
-        <w:rPr>
-          <w:rFonts w:ascii="Arial" w:cs="Arial" w:eastAsia="Arial" w:hAnsi="Arial"/>
-          <w:b/>
-          <w:bCs/>
-          <w:sz w:val="20"/>
-          <w:szCs w:val="20"/>
-        </w:rPr>
-        <w:t xml:space="preserve">[PEGAR AQUÍ: gráfico de Message rates / mensajes publicados y entregados]</w:t>
+        <w:spacing w:after="40" w:before="120"/>
+        <w:jc w:val="center"/>
+      </w:pPr>
+      <w:r/>
+      <w:r>
+        <w:drawing>
+          <wp:inline xmlns:a="http://schemas.openxmlformats.org/drawingml/2006/main" xmlns:pic="http://schemas.openxmlformats.org/drawingml/2006/picture">
+            <wp:extent cx="5486400" cy="3526971"/>
+            <wp:docPr id="3" name="Picture 3"/>
+            <wp:cNvGraphicFramePr>
+              <a:graphicFrameLocks noChangeAspect="1"/>
+            </wp:cNvGraphicFramePr>
+            <a:graphic>
+              <a:graphicData uri="http://schemas.openxmlformats.org/drawingml/2006/picture">
+                <pic:pic>
+                  <pic:nvPicPr>
+                    <pic:cNvPr id="0" name="01_exchanges.png"/>
+                    <pic:cNvPicPr/>
+                  </pic:nvPicPr>
+                  <pic:blipFill>
+                    <a:blip r:embed="rId10"/>
+                    <a:stretch>
+                      <a:fillRect/>
+                    </a:stretch>
+                  </pic:blipFill>
+                  <pic:spPr>
+                    <a:xfrm>
+                      <a:off x="0" y="0"/>
+                      <a:ext cx="5486400" cy="3526971"/>
+                    </a:xfrm>
+                    <a:prstGeom prst="rect"/>
+                  </pic:spPr>
+                </pic:pic>
+              </a:graphicData>
+            </a:graphic>
+          </wp:inline>
+        </w:drawing>
+      </w:r>
+    </w:p>
+    <w:p>
+      <w:pPr>
+        <w:spacing w:before="40" w:after="240"/>
+        <w:jc w:val="center"/>
+      </w:pPr>
+      <w:r>
+        <w:rPr>
+          <w:rFonts w:ascii="Arial" w:hAnsi="Arial"/>
+          <w:i/>
+          <w:color w:val="555555"/>
+          <w:sz w:val="18"/>
+        </w:rPr>
+        <w:t>Figura 2. Consola de administración de RabbitMQ: pestaña Exchanges mostrando pedidos.exchange (tipo topic, durable).</w:t>
+      </w:r>
+    </w:p>
+    <w:p>
+      <w:pPr>
+        <w:spacing w:after="40" w:before="120"/>
+        <w:jc w:val="center"/>
+      </w:pPr>
+      <w:r/>
+      <w:r>
+        <w:drawing>
+          <wp:inline xmlns:a="http://schemas.openxmlformats.org/drawingml/2006/main" xmlns:pic="http://schemas.openxmlformats.org/drawingml/2006/picture">
+            <wp:extent cx="5486400" cy="3526971"/>
+            <wp:docPr id="4" name="Picture 4"/>
+            <wp:cNvGraphicFramePr>
+              <a:graphicFrameLocks noChangeAspect="1"/>
+            </wp:cNvGraphicFramePr>
+            <a:graphic>
+              <a:graphicData uri="http://schemas.openxmlformats.org/drawingml/2006/picture">
+                <pic:pic>
+                  <pic:nvPicPr>
+                    <pic:cNvPr id="0" name="02_queues.png"/>
+                    <pic:cNvPicPr/>
+                  </pic:nvPicPr>
+                  <pic:blipFill>
+                    <a:blip r:embed="rId11"/>
+                    <a:stretch>
+                      <a:fillRect/>
+                    </a:stretch>
+                  </pic:blipFill>
+                  <pic:spPr>
+                    <a:xfrm>
+                      <a:off x="0" y="0"/>
+                      <a:ext cx="5486400" cy="3526971"/>
+                    </a:xfrm>
+                    <a:prstGeom prst="rect"/>
+                  </pic:spPr>
+                </pic:pic>
+              </a:graphicData>
+            </a:graphic>
+          </wp:inline>
+        </w:drawing>
+      </w:r>
+    </w:p>
+    <w:p>
+      <w:pPr>
+        <w:spacing w:before="40" w:after="240"/>
+        <w:jc w:val="center"/>
+      </w:pPr>
+      <w:r>
+        <w:rPr>
+          <w:rFonts w:ascii="Arial" w:hAnsi="Arial"/>
+          <w:i/>
+          <w:color w:val="555555"/>
+          <w:sz w:val="18"/>
+        </w:rPr>
+        <w:t>Figura 3. Pestaña Queues mostrando las 3 colas creadas: cocina.queue, notificaciones.queue y auditoria.queue en estado running.</w:t>
+      </w:r>
+    </w:p>
+    <w:p>
+      <w:pPr>
+        <w:spacing w:after="40" w:before="120"/>
+        <w:jc w:val="center"/>
+      </w:pPr>
+      <w:r/>
+      <w:r>
+        <w:drawing>
+          <wp:inline xmlns:a="http://schemas.openxmlformats.org/drawingml/2006/main" xmlns:pic="http://schemas.openxmlformats.org/drawingml/2006/picture">
+            <wp:extent cx="5486400" cy="3918857"/>
+            <wp:docPr id="5" name="Picture 5"/>
+            <wp:cNvGraphicFramePr>
+              <a:graphicFrameLocks noChangeAspect="1"/>
+            </wp:cNvGraphicFramePr>
+            <a:graphic>
+              <a:graphicData uri="http://schemas.openxmlformats.org/drawingml/2006/picture">
+                <pic:pic>
+                  <pic:nvPicPr>
+                    <pic:cNvPr id="0" name="03_exchange_bindings.png"/>
+                    <pic:cNvPicPr/>
+                  </pic:nvPicPr>
+                  <pic:blipFill>
+                    <a:blip r:embed="rId12"/>
+                    <a:stretch>
+                      <a:fillRect/>
+                    </a:stretch>
+                  </pic:blipFill>
+                  <pic:spPr>
+                    <a:xfrm>
+                      <a:off x="0" y="0"/>
+                      <a:ext cx="5486400" cy="3918857"/>
+                    </a:xfrm>
+                    <a:prstGeom prst="rect"/>
+                  </pic:spPr>
+                </pic:pic>
+              </a:graphicData>
+            </a:graphic>
+          </wp:inline>
+        </w:drawing>
+      </w:r>
+    </w:p>
+    <w:p>
+      <w:pPr>
+        <w:spacing w:before="40" w:after="240"/>
+        <w:jc w:val="center"/>
+      </w:pPr>
+      <w:r>
+        <w:rPr>
+          <w:rFonts w:ascii="Arial" w:hAnsi="Arial"/>
+          <w:i/>
+          <w:color w:val="555555"/>
+          <w:sz w:val="18"/>
+        </w:rPr>
+        <w:t>Figura 4. Detalle de pedidos.exchange y los 4 bindings configurados (pedido.creado.# y pedido.rechazado.#).</w:t>
+      </w:r>
+    </w:p>
+    <w:p>
+      <w:pPr>
+        <w:spacing w:after="40" w:before="120"/>
+        <w:jc w:val="center"/>
+      </w:pPr>
+      <w:r/>
+      <w:r>
+        <w:drawing>
+          <wp:inline xmlns:a="http://schemas.openxmlformats.org/drawingml/2006/main" xmlns:pic="http://schemas.openxmlformats.org/drawingml/2006/picture">
+            <wp:extent cx="5486400" cy="3526971"/>
+            <wp:docPr id="6" name="Picture 6"/>
+            <wp:cNvGraphicFramePr>
+              <a:graphicFrameLocks noChangeAspect="1"/>
+            </wp:cNvGraphicFramePr>
+            <a:graphic>
+              <a:graphicData uri="http://schemas.openxmlformats.org/drawingml/2006/picture">
+                <pic:pic>
+                  <pic:nvPicPr>
+                    <pic:cNvPr id="0" name="04_message_rates.png"/>
+                    <pic:cNvPicPr/>
+                  </pic:nvPicPr>
+                  <pic:blipFill>
+                    <a:blip r:embed="rId13"/>
+                    <a:stretch>
+                      <a:fillRect/>
+                    </a:stretch>
+                  </pic:blipFill>
+                  <pic:spPr>
+                    <a:xfrm>
+                      <a:off x="0" y="0"/>
+                      <a:ext cx="5486400" cy="3526971"/>
+                    </a:xfrm>
+                    <a:prstGeom prst="rect"/>
+                  </pic:spPr>
+                </pic:pic>
+              </a:graphicData>
+            </a:graphic>
+          </wp:inline>
+        </w:drawing>
+      </w:r>
+    </w:p>
+    <w:p>
+      <w:pPr>
+        <w:spacing w:before="40" w:after="240"/>
+        <w:jc w:val="center"/>
+      </w:pPr>
+      <w:r>
+        <w:rPr>
+          <w:rFonts w:ascii="Arial" w:hAnsi="Arial"/>
+          <w:i/>
+          <w:color w:val="555555"/>
+          <w:sz w:val="18"/>
+        </w:rPr>
+        <w:t>Figura 5. Métricas de tráfico en tiempo real (Message rates) con mensajes publicados, entregados y confirmados.</w:t>
       </w:r>
     </w:p>
     <w:p>

</xml_diff>